<commit_message>
refactor(names of csv file): refactored the 3 files of hypothesis csv to maintain prefix of the csv files output
</commit_message>
<xml_diff>
--- a/paper/Students Performance in Exam study.docx
+++ b/paper/Students Performance in Exam study.docx
@@ -1015,10 +1015,40 @@
         </w:rPr>
       </w:r>
     </w:p>
+    <w:p>
+      <w:pPr>
+        <w:ind w:left="0" w:firstLine="0"/>
+        <w:jc w:val="both"/>
+        <w:rPr>
+          <w:sz w:val="24"/>
+          <w:szCs w:val="24"/>
+        </w:rPr>
+      </w:pPr>
+      <w:r>
+        <w:rPr>
+          <w:rtl w:val="0"/>
+        </w:rPr>
+      </w:r>
+    </w:p>
+    <w:p>
+      <w:pPr>
+        <w:ind w:left="0" w:firstLine="0"/>
+        <w:jc w:val="both"/>
+        <w:rPr>
+          <w:sz w:val="24"/>
+          <w:szCs w:val="24"/>
+        </w:rPr>
+      </w:pPr>
+      <w:r>
+        <w:rPr>
+          <w:rtl w:val="0"/>
+        </w:rPr>
+      </w:r>
+    </w:p>
     <w:tbl>
       <w:tblPr>
         <w:tblStyle w:val="Table2"/>
-        <w:tblW w:w="4400.0" w:type="dxa"/>
+        <w:tblW w:w="4815.0" w:type="dxa"/>
         <w:jc w:val="left"/>
         <w:tblBorders>
           <w:top w:color="000000" w:space="0" w:sz="8" w:val="single"/>
@@ -1033,17 +1063,17 @@
       </w:tblPr>
       <w:tblGrid>
         <w:gridCol w:w="1020"/>
-        <w:gridCol w:w="680"/>
-        <w:gridCol w:w="880"/>
-        <w:gridCol w:w="800"/>
-        <w:gridCol w:w="1020"/>
+        <w:gridCol w:w="675"/>
+        <w:gridCol w:w="885"/>
+        <w:gridCol w:w="855"/>
+        <w:gridCol w:w="1380"/>
         <w:tblGridChange w:id="0">
           <w:tblGrid>
             <w:gridCol w:w="1020"/>
-            <w:gridCol w:w="680"/>
-            <w:gridCol w:w="880"/>
-            <w:gridCol w:w="800"/>
-            <w:gridCol w:w="1020"/>
+            <w:gridCol w:w="675"/>
+            <w:gridCol w:w="885"/>
+            <w:gridCol w:w="855"/>
+            <w:gridCol w:w="1380"/>
           </w:tblGrid>
         </w:tblGridChange>
       </w:tblGrid>
@@ -1949,7 +1979,7 @@
     </w:p>
     <w:p>
       <w:pPr>
-        <w:ind w:left="0" w:right="-566.9291338582677" w:firstLine="0"/>
+        <w:ind w:left="0" w:right="-566.9291338582677" w:firstLine="720"/>
         <w:jc w:val="both"/>
         <w:rPr>
           <w:sz w:val="24"/>
@@ -1998,12 +2028,12 @@
           <wp:inline distB="114300" distT="114300" distL="114300" distR="114300">
             <wp:extent cx="3306255" cy="1530260"/>
             <wp:effectExtent b="0" l="0" r="0" t="0"/>
-            <wp:docPr id="1" name="image2.png"/>
+            <wp:docPr id="2" name="image3.png"/>
             <a:graphic>
               <a:graphicData uri="http://schemas.openxmlformats.org/drawingml/2006/picture">
                 <pic:pic>
                   <pic:nvPicPr>
-                    <pic:cNvPr id="0" name="image2.png"/>
+                    <pic:cNvPr id="0" name="image3.png"/>
                     <pic:cNvPicPr preferRelativeResize="0"/>
                   </pic:nvPicPr>
                   <pic:blipFill>
@@ -2097,17 +2127,25 @@
         <w:rPr>
           <w:sz w:val="24"/>
           <w:szCs w:val="24"/>
+          <w:rtl w:val="0"/>
+        </w:rPr>
+        <w:br w:type="textWrapping"/>
+      </w:r>
+      <w:r>
+        <w:rPr>
+          <w:sz w:val="24"/>
+          <w:szCs w:val="24"/>
         </w:rPr>
         <w:drawing>
           <wp:inline distB="114300" distT="114300" distL="114300" distR="114300">
-            <wp:extent cx="2816479" cy="1524000"/>
+            <wp:extent cx="2962275" cy="990600"/>
             <wp:effectExtent b="0" l="0" r="0" t="0"/>
-            <wp:docPr id="2" name="image1.png"/>
+            <wp:docPr id="5" name="image6.png"/>
             <a:graphic>
               <a:graphicData uri="http://schemas.openxmlformats.org/drawingml/2006/picture">
                 <pic:pic>
                   <pic:nvPicPr>
-                    <pic:cNvPr id="0" name="image1.png"/>
+                    <pic:cNvPr id="0" name="image6.png"/>
                     <pic:cNvPicPr preferRelativeResize="0"/>
                   </pic:nvPicPr>
                   <pic:blipFill>
@@ -2120,7 +2158,7 @@
                   <pic:spPr>
                     <a:xfrm>
                       <a:off x="0" y="0"/>
-                      <a:ext cx="2816479" cy="1524000"/>
+                      <a:ext cx="2962275" cy="990600"/>
                     </a:xfrm>
                     <a:prstGeom prst="rect"/>
                     <a:ln/>
@@ -2133,11 +2171,33 @@
       </w:r>
       <w:r>
         <w:rPr>
-          <w:sz w:val="24"/>
-          <w:szCs w:val="24"/>
-          <w:rtl w:val="0"/>
-        </w:rPr>
-        <w:br w:type="textWrapping"/>
+          <w:rtl w:val="0"/>
+        </w:rPr>
+      </w:r>
+    </w:p>
+    <w:p>
+      <w:pPr>
+        <w:jc w:val="center"/>
+        <w:rPr>
+          <w:b w:val="1"/>
+          <w:bCs w:val="1"/>
+          <w:i w:val="1"/>
+          <w:iCs w:val="1"/>
+          <w:sz w:val="24"/>
+          <w:szCs w:val="24"/>
+        </w:rPr>
+      </w:pPr>
+      <w:r>
+        <w:rPr>
+          <w:b w:val="1"/>
+          <w:bCs w:val="1"/>
+          <w:i w:val="1"/>
+          <w:iCs w:val="1"/>
+          <w:sz w:val="24"/>
+          <w:szCs w:val="24"/>
+          <w:rtl w:val="0"/>
+        </w:rPr>
+        <w:t xml:space="preserve">Figure 4. Histogram of Math, Reading, and Writing Scores</w:t>
       </w:r>
     </w:p>
     <w:p>
@@ -2150,14 +2210,471 @@
       </w:pPr>
       <w:r>
         <w:rPr>
+          <w:sz w:val="24"/>
+          <w:szCs w:val="24"/>
+          <w:rtl w:val="0"/>
+        </w:rPr>
+        <w:t xml:space="preserve">As can be seen from the figure 4, most of the students scored in the mid to high 60s for each of the three subjects, which stood at 66.09 for math, 69.17 for reading, and 68.05 for writing. The same trend can be supported by the medians fo reach of the tree columns which stood at 66 for math, 70 fo reading, and 69 for writing. The range of each of the distributions appears to be relatively wide, with a standard deviation of approximately 14.6 to 15.2. This suggest that there is a significant variation in the performance of all the students in all the subjects. A small number of students have scored very low in each of the subjects, which is in line with the discussion of the outliers. </w:t>
+      </w:r>
+    </w:p>
+    <w:p>
+      <w:pPr>
+        <w:jc w:val="center"/>
+        <w:rPr>
+          <w:b w:val="1"/>
+          <w:bCs w:val="1"/>
+          <w:i w:val="1"/>
+          <w:iCs w:val="1"/>
+          <w:sz w:val="24"/>
+          <w:szCs w:val="24"/>
+        </w:rPr>
+      </w:pPr>
+      <w:r>
+        <w:rPr>
+          <w:sz w:val="24"/>
+          <w:szCs w:val="24"/>
+        </w:rPr>
+        <w:drawing>
+          <wp:inline distB="114300" distT="114300" distL="114300" distR="114300">
+            <wp:extent cx="2962275" cy="1854200"/>
+            <wp:effectExtent b="0" l="0" r="0" t="0"/>
+            <wp:docPr id="7" name="image2.png"/>
+            <a:graphic>
+              <a:graphicData uri="http://schemas.openxmlformats.org/drawingml/2006/picture">
+                <pic:pic>
+                  <pic:nvPicPr>
+                    <pic:cNvPr id="0" name="image2.png"/>
+                    <pic:cNvPicPr preferRelativeResize="0"/>
+                  </pic:nvPicPr>
+                  <pic:blipFill>
+                    <a:blip r:embed="rId13"/>
+                    <a:srcRect b="0" l="0" r="0" t="0"/>
+                    <a:stretch>
+                      <a:fillRect/>
+                    </a:stretch>
+                  </pic:blipFill>
+                  <pic:spPr>
+                    <a:xfrm>
+                      <a:off x="0" y="0"/>
+                      <a:ext cx="2962275" cy="1854200"/>
+                    </a:xfrm>
+                    <a:prstGeom prst="rect"/>
+                    <a:ln/>
+                  </pic:spPr>
+                </pic:pic>
+              </a:graphicData>
+            </a:graphic>
+          </wp:inline>
+        </w:drawing>
+      </w:r>
+      <w:r>
+        <w:rPr>
+          <w:b w:val="1"/>
+          <w:bCs w:val="1"/>
+          <w:i w:val="1"/>
+          <w:iCs w:val="1"/>
+          <w:sz w:val="24"/>
+          <w:szCs w:val="24"/>
+          <w:rtl w:val="0"/>
+        </w:rPr>
+        <w:t xml:space="preserve">Figure 5. Distributions of Gender</w:t>
+      </w:r>
+    </w:p>
+    <w:p>
+      <w:pPr>
+        <w:jc w:val="center"/>
+        <w:rPr>
+          <w:b w:val="1"/>
+          <w:bCs w:val="1"/>
+          <w:i w:val="1"/>
+          <w:iCs w:val="1"/>
+          <w:sz w:val="24"/>
+          <w:szCs w:val="24"/>
+        </w:rPr>
+      </w:pPr>
+      <w:r>
+        <w:rPr>
+          <w:sz w:val="24"/>
+          <w:szCs w:val="24"/>
+          <w:rtl w:val="0"/>
+        </w:rPr>
+        <w:t xml:space="preserve">The graph indicates the number of female and male students. THe total number of female students is 518, which represents 51.8%, and the total number of male students is 482, which represents 48.2%. This will be useful in comparing the performance between gender groups. </w:t>
+      </w:r>
+      <w:r>
+        <w:rPr>
+          <w:rtl w:val="0"/>
+        </w:rPr>
+      </w:r>
+    </w:p>
+    <w:p>
+      <w:pPr>
+        <w:jc w:val="center"/>
+        <w:rPr>
+          <w:b w:val="1"/>
+          <w:bCs w:val="1"/>
+          <w:i w:val="1"/>
+          <w:iCs w:val="1"/>
+          <w:sz w:val="24"/>
+          <w:szCs w:val="24"/>
+        </w:rPr>
+      </w:pPr>
+      <w:r>
+        <w:rPr>
+          <w:b w:val="1"/>
+          <w:bCs w:val="1"/>
+          <w:i w:val="1"/>
+          <w:iCs w:val="1"/>
+          <w:sz w:val="24"/>
+          <w:szCs w:val="24"/>
+        </w:rPr>
+        <w:drawing>
+          <wp:inline distB="114300" distT="114300" distL="114300" distR="114300">
+            <wp:extent cx="2962275" cy="1854200"/>
+            <wp:effectExtent b="0" l="0" r="0" t="0"/>
+            <wp:docPr id="1" name="image7.png"/>
+            <a:graphic>
+              <a:graphicData uri="http://schemas.openxmlformats.org/drawingml/2006/picture">
+                <pic:pic>
+                  <pic:nvPicPr>
+                    <pic:cNvPr id="0" name="image7.png"/>
+                    <pic:cNvPicPr preferRelativeResize="0"/>
+                  </pic:nvPicPr>
+                  <pic:blipFill>
+                    <a:blip r:embed="rId14"/>
+                    <a:srcRect b="0" l="0" r="0" t="0"/>
+                    <a:stretch>
+                      <a:fillRect/>
+                    </a:stretch>
+                  </pic:blipFill>
+                  <pic:spPr>
+                    <a:xfrm>
+                      <a:off x="0" y="0"/>
+                      <a:ext cx="2962275" cy="1854200"/>
+                    </a:xfrm>
+                    <a:prstGeom prst="rect"/>
+                    <a:ln/>
+                  </pic:spPr>
+                </pic:pic>
+              </a:graphicData>
+            </a:graphic>
+          </wp:inline>
+        </w:drawing>
+      </w:r>
+      <w:r>
+        <w:rPr>
+          <w:b w:val="1"/>
+          <w:bCs w:val="1"/>
+          <w:i w:val="1"/>
+          <w:iCs w:val="1"/>
+          <w:sz w:val="24"/>
+          <w:szCs w:val="24"/>
+          <w:rtl w:val="0"/>
+        </w:rPr>
+        <w:t xml:space="preserve">Figure 6. Distributions of Test Preparation</w:t>
+      </w:r>
+    </w:p>
+    <w:p>
+      <w:pPr>
+        <w:jc w:val="center"/>
+        <w:rPr>
+          <w:sz w:val="24"/>
+          <w:szCs w:val="24"/>
+        </w:rPr>
+      </w:pPr>
+      <w:r>
+        <w:rPr>
+          <w:sz w:val="24"/>
+          <w:szCs w:val="24"/>
+          <w:rtl w:val="0"/>
+        </w:rPr>
+        <w:t xml:space="preserve">The majority of students did not complete the test preparation course. The number of students in the none group is 642 (64.2%), and in the completed group is 358 (35.8%). This can be taken into accoun in interpreting hypothesis tests for comparisons of these two groups. </w:t>
+      </w:r>
+    </w:p>
+    <w:p>
+      <w:pPr>
+        <w:jc w:val="center"/>
+        <w:rPr>
+          <w:b w:val="1"/>
+          <w:bCs w:val="1"/>
+          <w:i w:val="1"/>
+          <w:iCs w:val="1"/>
+          <w:sz w:val="24"/>
+          <w:szCs w:val="24"/>
+        </w:rPr>
+      </w:pPr>
+      <w:r>
+        <w:rPr>
+          <w:b w:val="1"/>
+          <w:bCs w:val="1"/>
+          <w:i w:val="1"/>
+          <w:iCs w:val="1"/>
+          <w:sz w:val="24"/>
+          <w:szCs w:val="24"/>
+        </w:rPr>
+        <w:drawing>
+          <wp:inline distB="114300" distT="114300" distL="114300" distR="114300">
+            <wp:extent cx="2962275" cy="2120900"/>
+            <wp:effectExtent b="0" l="0" r="0" t="0"/>
+            <wp:docPr id="4" name="image1.png"/>
+            <a:graphic>
+              <a:graphicData uri="http://schemas.openxmlformats.org/drawingml/2006/picture">
+                <pic:pic>
+                  <pic:nvPicPr>
+                    <pic:cNvPr id="0" name="image1.png"/>
+                    <pic:cNvPicPr preferRelativeResize="0"/>
+                  </pic:nvPicPr>
+                  <pic:blipFill>
+                    <a:blip r:embed="rId15"/>
+                    <a:srcRect b="0" l="0" r="0" t="0"/>
+                    <a:stretch>
+                      <a:fillRect/>
+                    </a:stretch>
+                  </pic:blipFill>
+                  <pic:spPr>
+                    <a:xfrm>
+                      <a:off x="0" y="0"/>
+                      <a:ext cx="2962275" cy="2120900"/>
+                    </a:xfrm>
+                    <a:prstGeom prst="rect"/>
+                    <a:ln/>
+                  </pic:spPr>
+                </pic:pic>
+              </a:graphicData>
+            </a:graphic>
+          </wp:inline>
+        </w:drawing>
+      </w:r>
+      <w:r>
+        <w:rPr>
+          <w:b w:val="1"/>
+          <w:bCs w:val="1"/>
+          <w:i w:val="1"/>
+          <w:iCs w:val="1"/>
+          <w:sz w:val="24"/>
+          <w:szCs w:val="24"/>
+          <w:rtl w:val="0"/>
+        </w:rPr>
+        <w:t xml:space="preserve">Figure 7. Scatterplot of Math Score vs Reading Score</w:t>
+      </w:r>
+    </w:p>
+    <w:p>
+      <w:pPr>
+        <w:jc w:val="both"/>
+        <w:rPr>
+          <w:b w:val="1"/>
+          <w:bCs w:val="1"/>
+          <w:i w:val="1"/>
+          <w:iCs w:val="1"/>
+          <w:sz w:val="24"/>
+          <w:szCs w:val="24"/>
+        </w:rPr>
+      </w:pPr>
+      <w:r>
+        <w:rPr>
+          <w:i w:val="1"/>
+          <w:iCs w:val="1"/>
+          <w:sz w:val="24"/>
+          <w:szCs w:val="24"/>
+          <w:rtl w:val="0"/>
+        </w:rPr>
+        <w:t xml:space="preserve">Figure 7 shows that there is a strong positive linear association between math and reading scores. If a student performs well in math, it is likely it also performs well in reading. Moreover, the Pearson correlation coefficient of the two 0.818, showing that there is a strong linear association between these two scores.</w:t>
+      </w:r>
+      <w:r>
+        <w:rPr>
+          <w:b w:val="1"/>
+          <w:bCs w:val="1"/>
+          <w:i w:val="1"/>
+          <w:iCs w:val="1"/>
+          <w:sz w:val="24"/>
+          <w:szCs w:val="24"/>
+        </w:rPr>
+        <w:drawing>
+          <wp:inline distB="114300" distT="114300" distL="114300" distR="114300">
+            <wp:extent cx="2962275" cy="2120900"/>
+            <wp:effectExtent b="0" l="0" r="0" t="0"/>
+            <wp:docPr id="3" name="image4.png"/>
+            <a:graphic>
+              <a:graphicData uri="http://schemas.openxmlformats.org/drawingml/2006/picture">
+                <pic:pic>
+                  <pic:nvPicPr>
+                    <pic:cNvPr id="0" name="image4.png"/>
+                    <pic:cNvPicPr preferRelativeResize="0"/>
+                  </pic:nvPicPr>
+                  <pic:blipFill>
+                    <a:blip r:embed="rId16"/>
+                    <a:srcRect b="0" l="0" r="0" t="0"/>
+                    <a:stretch>
+                      <a:fillRect/>
+                    </a:stretch>
+                  </pic:blipFill>
+                  <pic:spPr>
+                    <a:xfrm>
+                      <a:off x="0" y="0"/>
+                      <a:ext cx="2962275" cy="2120900"/>
+                    </a:xfrm>
+                    <a:prstGeom prst="rect"/>
+                    <a:ln/>
+                  </pic:spPr>
+                </pic:pic>
+              </a:graphicData>
+            </a:graphic>
+          </wp:inline>
+        </w:drawing>
+      </w:r>
+      <w:r>
+        <w:rPr>
+          <w:b w:val="1"/>
+          <w:bCs w:val="1"/>
+          <w:i w:val="1"/>
+          <w:iCs w:val="1"/>
+          <w:sz w:val="24"/>
+          <w:szCs w:val="24"/>
+          <w:rtl w:val="0"/>
+        </w:rPr>
+        <w:t xml:space="preserve">Figure 8. Scatterplot of Math Score vs Writing Score</w:t>
+      </w:r>
+    </w:p>
+    <w:p>
+      <w:pPr>
+        <w:jc w:val="both"/>
+        <w:rPr>
+          <w:b w:val="1"/>
+          <w:bCs w:val="1"/>
+          <w:i w:val="1"/>
+          <w:iCs w:val="1"/>
+          <w:sz w:val="24"/>
+          <w:szCs w:val="24"/>
+        </w:rPr>
+      </w:pPr>
+      <w:r>
+        <w:rPr>
+          <w:sz w:val="24"/>
+          <w:szCs w:val="24"/>
+          <w:rtl w:val="0"/>
+        </w:rPr>
+        <w:t xml:space="preserve">Figure 8 also shows a strong positive linear association between math and writing scores. If a student performs well in math, it is likely that it is also performing well in writing. Furthermore, the Pearson correlation coefficient of math and writing is 0.803, showing that there is a strong linear association between these two scores. </w:t>
+      </w:r>
+      <w:r>
+        <w:rPr>
+          <w:b w:val="1"/>
+          <w:bCs w:val="1"/>
+          <w:i w:val="1"/>
+          <w:iCs w:val="1"/>
+          <w:sz w:val="24"/>
+          <w:szCs w:val="24"/>
+        </w:rPr>
+        <w:drawing>
+          <wp:inline distB="114300" distT="114300" distL="114300" distR="114300">
+            <wp:extent cx="2962275" cy="2120900"/>
+            <wp:effectExtent b="0" l="0" r="0" t="0"/>
+            <wp:docPr id="6" name="image5.png"/>
+            <a:graphic>
+              <a:graphicData uri="http://schemas.openxmlformats.org/drawingml/2006/picture">
+                <pic:pic>
+                  <pic:nvPicPr>
+                    <pic:cNvPr id="0" name="image5.png"/>
+                    <pic:cNvPicPr preferRelativeResize="0"/>
+                  </pic:nvPicPr>
+                  <pic:blipFill>
+                    <a:blip r:embed="rId17"/>
+                    <a:srcRect b="0" l="0" r="0" t="0"/>
+                    <a:stretch>
+                      <a:fillRect/>
+                    </a:stretch>
+                  </pic:blipFill>
+                  <pic:spPr>
+                    <a:xfrm>
+                      <a:off x="0" y="0"/>
+                      <a:ext cx="2962275" cy="2120900"/>
+                    </a:xfrm>
+                    <a:prstGeom prst="rect"/>
+                    <a:ln/>
+                  </pic:spPr>
+                </pic:pic>
+              </a:graphicData>
+            </a:graphic>
+          </wp:inline>
+        </w:drawing>
+      </w:r>
+      <w:r>
+        <w:rPr>
+          <w:b w:val="1"/>
+          <w:bCs w:val="1"/>
+          <w:i w:val="1"/>
+          <w:iCs w:val="1"/>
+          <w:sz w:val="24"/>
+          <w:szCs w:val="24"/>
+          <w:rtl w:val="0"/>
+        </w:rPr>
+        <w:t xml:space="preserve">Figure 9. Scatterplot of Reading Score vs Writing Score</w:t>
+      </w:r>
+    </w:p>
+    <w:p>
+      <w:pPr>
+        <w:jc w:val="both"/>
+        <w:rPr>
+          <w:sz w:val="24"/>
+          <w:szCs w:val="24"/>
+        </w:rPr>
+      </w:pPr>
+      <w:r>
+        <w:rPr>
+          <w:sz w:val="24"/>
+          <w:szCs w:val="24"/>
+          <w:rtl w:val="0"/>
+        </w:rPr>
+        <w:t xml:space="preserve">Figure 9 also shows a strong positive linear association between the scores. In addition, the association between the two is the strongest compared to Figure 7 and Figure 8. The Pearson correlation coefficient of reading and writing is 0.955. </w:t>
+      </w:r>
+    </w:p>
+    <w:p>
+      <w:pPr>
+        <w:jc w:val="both"/>
+        <w:rPr>
+          <w:sz w:val="24"/>
+          <w:szCs w:val="24"/>
+        </w:rPr>
+      </w:pPr>
+      <w:r>
+        <w:rPr>
+          <w:rtl w:val="0"/>
+        </w:rPr>
+      </w:r>
+    </w:p>
+    <w:p>
+      <w:pPr>
+        <w:jc w:val="both"/>
+        <w:rPr>
+          <w:sz w:val="24"/>
+          <w:szCs w:val="24"/>
+        </w:rPr>
+      </w:pPr>
+      <w:r>
+        <w:rPr>
+          <w:sz w:val="24"/>
+          <w:szCs w:val="24"/>
+          <w:rtl w:val="0"/>
+        </w:rPr>
+        <w:t xml:space="preserve">The data set has 1000 data points and 8 variables, with five categorical variables (gender, race/ethnicity, parental level of education, lunch, and test preparation course) and three numeric variables (math, reading, and writing scores). The descriptive statistics reveal similar average performance in all three subjects, with reading scores slightly higher than writing and math scores. The histogram (Figure 4) represents the distributions of scores, and the barcharts (Figures 5-6) provide an overview of the essential categorical variables. The scatter plots (Figure 7-9) illustrate strong positive correlation between the numeric variables, indicating students who perform better in one subject tend to perform better in another. </w:t>
+      </w:r>
+    </w:p>
+    <w:p>
+      <w:pPr>
+        <w:jc w:val="both"/>
+        <w:rPr>
+          <w:sz w:val="24"/>
+          <w:szCs w:val="24"/>
+        </w:rPr>
+      </w:pPr>
+      <w:r>
+        <w:rPr>
           <w:rtl w:val="0"/>
         </w:rPr>
       </w:r>
     </w:p>
     <w:sectPr>
-      <w:headerReference r:id="rId13" w:type="default"/>
-      <w:headerReference r:id="rId14" w:type="first"/>
-      <w:footerReference r:id="rId15" w:type="first"/>
+      <w:headerReference r:id="rId18" w:type="default"/>
+      <w:headerReference r:id="rId19" w:type="first"/>
+      <w:footerReference r:id="rId20" w:type="first"/>
       <w:pgSz w:h="15840" w:w="12240" w:orient="portrait"/>
       <w:pgMar w:bottom="1440" w:top="1440" w:left="850.3937007874016" w:right="1440" w:header="720" w:footer="720"/>
       <w:pgNumType w:start="1"/>

</xml_diff>